<commit_message>
Remove LexNova branding from AI document templates
</commit_message>
<xml_diff>
--- a/diligence-artifact-backend/references/document-templates/ai/v2_1/lane-a/DOC_AI_A_AGT_QR_READY_v2_1.docx
+++ b/diligence-artifact-backend/references/document-templates/ai/v2_1/lane-a/DOC_AI_A_AGT_QR_READY_v2_1.docx
@@ -72,7 +72,7 @@
           <w:sz w:val="32"/>
           <w:szCs w:val="32"/>
         </w:rPr>
-        <w:t>LEX NO</w:t>
+        <w:t>AI GOVERNANCE:</w:t>
       </w:r>
       <w:r>
         <w:rPr>
@@ -81,7 +81,7 @@
           <w:sz w:val="32"/>
           <w:szCs w:val="32"/>
         </w:rPr>
-        <w:t xml:space="preserve">VA </w:t>
+        <w:t xml:space="preserve"/>
       </w:r>
       <w:r>
         <w:rPr>
@@ -90,7 +90,7 @@
           <w:sz w:val="32"/>
           <w:szCs w:val="32"/>
         </w:rPr>
-        <w:t xml:space="preserve">HQ </w:t>
+        <w:t xml:space="preserve"/>
       </w:r>
       <w:r>
         <w:rPr>
@@ -99,7 +99,7 @@
           <w:sz w:val="32"/>
           <w:szCs w:val="32"/>
         </w:rPr>
-        <w:t xml:space="preserve">– AI </w:t>
+        <w:t xml:space="preserve"/>
       </w:r>
       <w:r>
         <w:rPr>
@@ -108,7 +108,7 @@
           <w:sz w:val="32"/>
           <w:szCs w:val="32"/>
         </w:rPr>
-        <w:t>GOVERNANCE:</w:t>
+        <w:t/>
       </w:r>
       <w:r>
         <w:rPr>
@@ -447,7 +447,7 @@
           <w:i/>
           <w:iCs/>
         </w:rPr>
-        <w:t>This document is a Review-Ready Draft prepared by Lex Nova HQ. It is approximately 95% complete and requires review by qualified local counsel in Customer's jurisdiction before execution. This document does not constitute legal advice. Lex Nova HQ is a Legal Architecture consultancy, not a law firm.</w:t>
+        <w:t>This document is a Review-Ready Draft. It is approximately 95% complete and requires review by qualified local counsel in Customer's jurisdiction before execution. This document does not constitute legal advice. The document preparer is a legal architecture provider, not a law firm.</w:t>
       </w:r>
     </w:p>
     <w:p>
@@ -7947,7 +7947,7 @@
           <w:i/>
           <w:iCs/>
         </w:rPr>
-        <w:t>For Lex Nova HQ Internal Use Only. Never included in client deliverables</w:t>
+        <w:t>Internal Use Only. Never included in client deliverables</w:t>
       </w:r>
       <w:r>
         <w:t>.</w:t>
@@ -10364,7 +10364,7 @@
           <w:i/>
           <w:iCs/>
         </w:rPr>
-        <w:t>For Lex Nova HQ Delivery Team. Not included in client deliverables.</w:t>
+        <w:t>For Delivery Team. Not included in client deliverables.</w:t>
       </w:r>
     </w:p>
     <w:p>
@@ -17154,14 +17154,14 @@
               <w:sz w:val="16"/>
               <w:szCs w:val="16"/>
             </w:rPr>
-            <w:t>Lex Nova HQ —</w:t>
+            <w:t/>
           </w:r>
           <w:r>
             <w:rPr>
               <w:sz w:val="16"/>
               <w:szCs w:val="16"/>
             </w:rPr>
-            <w:t xml:space="preserve"> DOC_AGT_AI</w:t>
+            <w:t xml:space="preserve">DOC_AGT_AI</w:t>
           </w:r>
         </w:p>
       </w:tc>
@@ -17389,14 +17389,14 @@
               <w:sz w:val="16"/>
               <w:szCs w:val="16"/>
             </w:rPr>
-            <w:t>Lex Nova HQ —</w:t>
+            <w:t/>
           </w:r>
           <w:r>
             <w:rPr>
               <w:sz w:val="16"/>
               <w:szCs w:val="16"/>
             </w:rPr>
-            <w:t xml:space="preserve"> DOC_</w:t>
+            <w:t xml:space="preserve">DOC_</w:t>
           </w:r>
           <w:r>
             <w:rPr>

</xml_diff>